<commit_message>
feat(docx): refine layout and default citation locale
</commit_message>
<xml_diff>
--- a/share/templates/fexport-default.docx
+++ b/share/templates/fexport-default.docx
@@ -1223,7 +1223,7 @@
     <w:qFormat/>
     <w:rsid w:val="006D156B"/>
     <w:pPr>
-      <w:spacing w:line="360" w:lineRule="auto"/>
+      <w:spacing w:line="312" w:lineRule="auto" w:after="120"/>
       <w:jc w:val="both"/>
     </w:pPr>
     <w:rPr>
@@ -1527,8 +1527,9 @@
     <w:qFormat/>
     <w:rsid w:val="00945154"/>
     <w:pPr>
-      <w:spacing w:line="240" w:lineRule="auto"/>
+      <w:spacing w:line="240" w:lineRule="auto" w:after="60"/>
       <w:ind w:firstLineChars="0" w:firstLine="0"/>
+      <w:jc w:val="left"/>
     </w:pPr>
     <w:rPr>
       <w:sz w:val="18"/>
@@ -1611,7 +1612,7 @@
     <w:next w:val="BodyText"/>
     <w:qFormat/>
     <w:pPr>
-      <w:ind w:firstLine="0" w:firstLineChars="0"/>
+      <w:ind w:firstLineChars="200"/>
     </w:pPr>
   </w:style>
   <w:style w:type="paragraph" w:customStyle="1" w:styleId="Compact">
@@ -1943,6 +1944,26 @@
       <w:spacing w:line="240" w:lineRule="auto"/>
       <w:ind w:firstLine="0" w:firstLineChars="0"/>
     </w:pPr>
+    <w:rPr>
+      <w:sz w:val="18"/>
+      <w:szCs w:val="18"/>
+    </w:rPr>
+  </w:style>
+  <w:style w:type="paragraph" w:customStyle="1" w:styleId="FigureNote">
+    <w:name w:val="Figure Note"/>
+    <w:basedOn w:val="SourceNote"/>
+    <w:next w:val="BodyText"/>
+    <w:qFormat/>
+    <w:rPr>
+      <w:sz w:val="18"/>
+      <w:szCs w:val="18"/>
+    </w:rPr>
+  </w:style>
+  <w:style w:type="paragraph" w:customStyle="1" w:styleId="TableNote">
+    <w:name w:val="Table Note"/>
+    <w:basedOn w:val="SourceNote"/>
+    <w:next w:val="BodyText"/>
+    <w:qFormat/>
     <w:rPr>
       <w:sz w:val="18"/>
       <w:szCs w:val="18"/>

</xml_diff>

<commit_message>
fix(docx): align note style names with custom-style
</commit_message>
<xml_diff>
--- a/share/templates/fexport-default.docx
+++ b/share/templates/fexport-default.docx
@@ -1950,7 +1950,7 @@
     </w:rPr>
   </w:style>
   <w:style w:type="paragraph" w:customStyle="1" w:styleId="FigureNote">
-    <w:name w:val="Figure Note"/>
+    <w:name w:val="FigureNote"/>
     <w:basedOn w:val="SourceNote"/>
     <w:next w:val="BodyText"/>
     <w:qFormat/>
@@ -1960,7 +1960,7 @@
     </w:rPr>
   </w:style>
   <w:style w:type="paragraph" w:customStyle="1" w:styleId="TableNote">
-    <w:name w:val="Table Note"/>
+    <w:name w:val="TableNote"/>
     <w:basedOn w:val="SourceNote"/>
     <w:next w:val="BodyText"/>
     <w:qFormat/>

</xml_diff>